<commit_message>
Q04–Q05: chuẩn hóa 25 màn và bàn giao benchmark (#18)
* 24120219 - clean handoff and consolidate benchmark tools in Src

* 24120219 - Q04: record and verify 300 benchmark runs on e5fe581

* 24120219 - normalize 25 stages and consolidate benchmark aggregation in cli

* 24120219 - Q04 Q05: deliver rerun data and methodology for stages 1-25
</commit_message>
<xml_diff>
--- a/handoff/quan/dfs.docx
+++ b/handoff/quan/dfs.docx
@@ -21,7 +21,7 @@
     </w:p>
     <w:p>
       <w:r>
-        <w:t>Cập nhật ngày 31/10/2026. Đối chiếu member2_dfs.py và engine core/board.py sau khi đồng bộ main d763322; bộ chơi hiện có 25 màn và 12 ca biên.</w:t>
+        <w:t>Cập nhật ngày 31/10/2026. Đối chiếu member2_dfs.py và engine core/board.py tại snapshot 0d7adc5; bộ chơi hiện có 25 màn ID 1–25 và 12 ca biên.</w:t>
       </w:r>
     </w:p>
     <w:p>
@@ -469,7 +469,7 @@
     </w:p>
     <w:p>
       <w:r>
-        <w:t>Trial trên source main d763322 đã cho nhóm đích nông có nghiệm tối ưu 2 bước. DFS ở bốn góc xoay trả 75, 198, 136 và 2 bước. Đây là đối chứng về thứ tự duyệt, không phải bốn bài toán độc lập hay bằng chứng DFS luôn chậm. Dữ liệu đầy đủ nằm ở comparison-study/trial-main-d763322; chưa phải lượt đo lặp chính thức Q04.</w:t>
+        <w:t>Trial trên source main d763322 đã cho nhóm đích nông có nghiệm tối ưu 2 bước. DFS ở bốn góc xoay trả 75, 198, 136 và 2 bước. Đây là đối chứng về thứ tự duyệt, không phải bốn bài toán độc lập hay bằng chứng DFS luôn chậm. Dữ liệu đầy đủ nằm ở commit 3a9f3a0 trong Git; chưa phải lượt đo lặp chính thức Q04.</w:t>
       </w:r>
     </w:p>
     <w:p>

</xml_diff>

<commit_message>
Revert PR #18 and restore the pre-PR repository
</commit_message>
<xml_diff>
--- a/handoff/quan/dfs.docx
+++ b/handoff/quan/dfs.docx
@@ -21,7 +21,7 @@
     </w:p>
     <w:p>
       <w:r>
-        <w:t>Cập nhật ngày 31/10/2026. Đối chiếu member2_dfs.py và engine core/board.py tại snapshot 0d7adc5; bộ chơi hiện có 25 màn ID 1–25 và 12 ca biên.</w:t>
+        <w:t>Cập nhật ngày 31/10/2026. Đối chiếu member2_dfs.py và engine core/board.py sau khi đồng bộ main d763322; bộ chơi hiện có 25 màn và 12 ca biên.</w:t>
       </w:r>
     </w:p>
     <w:p>
@@ -469,7 +469,7 @@
     </w:p>
     <w:p>
       <w:r>
-        <w:t>Trial trên source main d763322 đã cho nhóm đích nông có nghiệm tối ưu 2 bước. DFS ở bốn góc xoay trả 75, 198, 136 và 2 bước. Đây là đối chứng về thứ tự duyệt, không phải bốn bài toán độc lập hay bằng chứng DFS luôn chậm. Dữ liệu đầy đủ nằm ở commit 3a9f3a0 trong Git; chưa phải lượt đo lặp chính thức Q04.</w:t>
+        <w:t>Trial trên source main d763322 đã cho nhóm đích nông có nghiệm tối ưu 2 bước. DFS ở bốn góc xoay trả 75, 198, 136 và 2 bước. Đây là đối chứng về thứ tự duyệt, không phải bốn bài toán độc lập hay bằng chứng DFS luôn chậm. Dữ liệu đầy đủ nằm ở comparison-study/trial-main-d763322; chưa phải lượt đo lặp chính thức Q04.</w:t>
       </w:r>
     </w:p>
     <w:p>

</xml_diff>